<commit_message>
Apply Gilbert's citation-date guidance; fix credit line, translations, and stale R/ paths
- references.yaml/.bib: drop consulted-on dates from archival sources
  (Migneret scan, Fontenelle text, Chevaliers slides) per Gilbert's
  reply; keep them on the Medium piece and the new Tao/Simons
  Foundation citation.
- chronique.qmd: credit the two Table 1 examples to Migneret (both
  are printed in the pamphlet) rather than Antoine; retranslate the
  two verses to treat licite as the adverb it is; fix a stale
  oracle-modern.R path reference; add a drum emoji to the drumroll
  aside.
- Annex.qmd: fix a stale oracle-tests.R run command; add a paragraph
  pointing readers to this repository's R/ folder.
</commit_message>
<xml_diff>
--- a/Annex.docx
+++ b/Annex.docx
@@ -26,7 +26,7 @@
         <w:t xml:space="preserve">Michael Friendly</w:t>
       </w:r>
     </w:p>
-    <w:bookmarkStart w:id="18" w:name="what-this-is"/>
+    <w:bookmarkStart w:id="19" w:name="what-this-is"/>
     <w:p>
       <w:pPr>
         <w:pStyle w:val="Heading2"/>
@@ -102,7 +102,21 @@
         <w:pStyle w:val="BodyText"/>
       </w:pPr>
       <w:r>
-        <w:t xml:space="preserve">To use it, source the file and ask a question. The</w:t>
+        <w:t xml:space="preserve">The files are available from a public GitHub repository,</w:t>
+      </w:r>
+      <w:r>
+        <w:t xml:space="preserve"> </w:t>
+      </w:r>
+      <w:hyperlink r:id="rId18">
+        <w:r>
+          <w:rPr>
+            <w:rStyle w:val="Hyperlink"/>
+          </w:rPr>
+          <w:t xml:space="preserve">https://github.com/friendly/chatgpt-1759</w:t>
+        </w:r>
+      </w:hyperlink>
+      <w:r>
+        <w:t xml:space="preserve">, in its</w:t>
       </w:r>
       <w:r>
         <w:t xml:space="preserve"> </w:t>
@@ -111,122 +125,155 @@
         <w:rPr>
           <w:rStyle w:val="VerbatimChar"/>
         </w:rPr>
-        <w:t xml:space="preserve">encoding</w:t>
-      </w:r>
-      <w:r>
-        <w:t xml:space="preserve"> </w:t>
-      </w:r>
-      <w:r>
-        <w:t xml:space="preserve">argument matters on systems where R does not read files as UTF-8 by default.</w:t>
+        <w:t xml:space="preserve">R/</w:t>
+      </w:r>
+      <w:r>
+        <w:t xml:space="preserve"> </w:t>
+      </w:r>
+      <w:r>
+        <w:t xml:space="preserve">folder:</w:t>
+      </w:r>
+      <w:r>
+        <w:t xml:space="preserve"> </w:t>
+      </w:r>
+      <w:r>
+        <w:rPr>
+          <w:rStyle w:val="VerbatimChar"/>
+        </w:rPr>
+        <w:t xml:space="preserve">oracle.R</w:t>
+      </w:r>
+      <w:r>
+        <w:t xml:space="preserve">,</w:t>
+      </w:r>
+      <w:r>
+        <w:t xml:space="preserve"> </w:t>
+      </w:r>
+      <w:r>
+        <w:rPr>
+          <w:rStyle w:val="VerbatimChar"/>
+        </w:rPr>
+        <w:t xml:space="preserve">oracle-tests.R</w:t>
+      </w:r>
+      <w:r>
+        <w:t xml:space="preserve">, and</w:t>
+      </w:r>
+      <w:r>
+        <w:t xml:space="preserve"> </w:t>
+      </w:r>
+      <w:r>
+        <w:rPr>
+          <w:rStyle w:val="VerbatimChar"/>
+        </w:rPr>
+        <w:t xml:space="preserve">oracle-modern.R</w:t>
+      </w:r>
+      <w:r>
+        <w:t xml:space="preserve"> </w:t>
+      </w:r>
+      <w:r>
+        <w:t xml:space="preserve">(the Oracle asked four modern questions, referred to in the column). Download the repository, or save the files individually from there.</w:t>
       </w:r>
     </w:p>
     <w:p>
       <w:pPr>
-        <w:pStyle w:val="SourceCode"/>
-      </w:pPr>
-      <w:r>
-        <w:rPr>
-          <w:rStyle w:val="FunctionTok"/>
-        </w:rPr>
-        <w:t xml:space="preserve">source</w:t>
-      </w:r>
-      <w:r>
-        <w:rPr>
-          <w:rStyle w:val="NormalTok"/>
-        </w:rPr>
-        <w:t xml:space="preserve">(</w:t>
-      </w:r>
-      <w:r>
-        <w:rPr>
-          <w:rStyle w:val="StringTok"/>
-        </w:rPr>
-        <w:t xml:space="preserve">"oracle.R"</w:t>
-      </w:r>
-      <w:r>
-        <w:rPr>
-          <w:rStyle w:val="NormalTok"/>
-        </w:rPr>
-        <w:t xml:space="preserve">, </w:t>
-      </w:r>
-      <w:r>
-        <w:rPr>
-          <w:rStyle w:val="AttributeTok"/>
-        </w:rPr>
-        <w:t xml:space="preserve">encoding =</w:t>
-      </w:r>
-      <w:r>
-        <w:rPr>
-          <w:rStyle w:val="NormalTok"/>
-        </w:rPr>
-        <w:t xml:space="preserve"> </w:t>
-      </w:r>
-      <w:r>
-        <w:rPr>
-          <w:rStyle w:val="StringTok"/>
-        </w:rPr>
-        <w:t xml:space="preserve">"UTF-8"</w:t>
-      </w:r>
-      <w:r>
-        <w:rPr>
-          <w:rStyle w:val="NormalTok"/>
-        </w:rPr>
-        <w:t xml:space="preserve">)</w:t>
-      </w:r>
-    </w:p>
-    <w:bookmarkEnd w:id="18"/>
-    <w:bookmarkStart w:id="19" w:name="using-the-oracle"/>
-    <w:p>
-      <w:pPr>
-        <w:pStyle w:val="Heading2"/>
-      </w:pPr>
-      <w:r>
-        <w:t xml:space="preserve">Using the Oracle</w:t>
+        <w:pStyle w:val="BodyText"/>
+      </w:pPr>
+      <w:r>
+        <w:t xml:space="preserve">To use it, source the file and ask a question. The</w:t>
+      </w:r>
+      <w:r>
+        <w:t xml:space="preserve"> </w:t>
+      </w:r>
+      <w:r>
+        <w:rPr>
+          <w:rStyle w:val="VerbatimChar"/>
+        </w:rPr>
+        <w:t xml:space="preserve">encoding</w:t>
+      </w:r>
+      <w:r>
+        <w:t xml:space="preserve"> </w:t>
+      </w:r>
+      <w:r>
+        <w:t xml:space="preserve">argument matters on systems where R does not read files as UTF-8 by default.</w:t>
       </w:r>
     </w:p>
     <w:p>
       <w:pPr>
-        <w:pStyle w:val="FirstParagraph"/>
-      </w:pPr>
-      <w:r>
-        <w:rPr>
-          <w:rStyle w:val="VerbatimChar"/>
-        </w:rPr>
-        <w:t xml:space="preserve">Oracle(question, output, show.steps)</w:t>
-      </w:r>
-      <w:r>
-        <w:t xml:space="preserve"> </w:t>
-      </w:r>
-      <w:r>
-        <w:t xml:space="preserve">takes a question as a single string, or as a vector of words. The question of Table 1 in the column, in Migneret’s words:</w:t>
+        <w:pStyle w:val="SourceCode"/>
+      </w:pPr>
+      <w:r>
+        <w:rPr>
+          <w:rStyle w:val="FunctionTok"/>
+        </w:rPr>
+        <w:t xml:space="preserve">source</w:t>
+      </w:r>
+      <w:r>
+        <w:rPr>
+          <w:rStyle w:val="NormalTok"/>
+        </w:rPr>
+        <w:t xml:space="preserve">(</w:t>
+      </w:r>
+      <w:r>
+        <w:rPr>
+          <w:rStyle w:val="StringTok"/>
+        </w:rPr>
+        <w:t xml:space="preserve">"oracle.R"</w:t>
+      </w:r>
+      <w:r>
+        <w:rPr>
+          <w:rStyle w:val="NormalTok"/>
+        </w:rPr>
+        <w:t xml:space="preserve">, </w:t>
+      </w:r>
+      <w:r>
+        <w:rPr>
+          <w:rStyle w:val="AttributeTok"/>
+        </w:rPr>
+        <w:t xml:space="preserve">encoding =</w:t>
+      </w:r>
+      <w:r>
+        <w:rPr>
+          <w:rStyle w:val="NormalTok"/>
+        </w:rPr>
+        <w:t xml:space="preserve"> </w:t>
+      </w:r>
+      <w:r>
+        <w:rPr>
+          <w:rStyle w:val="StringTok"/>
+        </w:rPr>
+        <w:t xml:space="preserve">"UTF-8"</w:t>
+      </w:r>
+      <w:r>
+        <w:rPr>
+          <w:rStyle w:val="NormalTok"/>
+        </w:rPr>
+        <w:t xml:space="preserve">)</w:t>
+      </w:r>
+    </w:p>
+    <w:bookmarkEnd w:id="19"/>
+    <w:bookmarkStart w:id="20" w:name="using-the-oracle"/>
+    <w:p>
+      <w:pPr>
+        <w:pStyle w:val="Heading2"/>
+      </w:pPr>
+      <w:r>
+        <w:t xml:space="preserve">Using the Oracle</w:t>
       </w:r>
     </w:p>
     <w:p>
       <w:pPr>
-        <w:pStyle w:val="SourceCode"/>
-      </w:pPr>
-      <w:r>
-        <w:rPr>
-          <w:rStyle w:val="FunctionTok"/>
-        </w:rPr>
-        <w:t xml:space="preserve">Oracle</w:t>
-      </w:r>
-      <w:r>
-        <w:rPr>
-          <w:rStyle w:val="NormalTok"/>
-        </w:rPr>
-        <w:t xml:space="preserve">(</w:t>
-      </w:r>
-      <w:r>
-        <w:rPr>
-          <w:rStyle w:val="StringTok"/>
-        </w:rPr>
-        <w:t xml:space="preserve">"Celui que j'aime deviendra-t-il cette année mon époux ?"</w:t>
-      </w:r>
-      <w:r>
-        <w:rPr>
-          <w:rStyle w:val="NormalTok"/>
-        </w:rPr>
-        <w:t xml:space="preserve">)</w:t>
+        <w:pStyle w:val="FirstParagraph"/>
+      </w:pPr>
+      <w:r>
+        <w:rPr>
+          <w:rStyle w:val="VerbatimChar"/>
+        </w:rPr>
+        <w:t xml:space="preserve">Oracle(question, output, show.steps)</w:t>
+      </w:r>
+      <w:r>
+        <w:t xml:space="preserve"> </w:t>
+      </w:r>
+      <w:r>
+        <w:t xml:space="preserve">takes a question as a single string, or as a vector of words. The question of Table 1 in the column, in Migneret’s words:</w:t>
       </w:r>
     </w:p>
     <w:p>
@@ -235,13 +282,42 @@
       </w:pPr>
       <w:r>
         <w:rPr>
-          <w:rStyle w:val="VerbatimChar"/>
-        </w:rPr>
-        <w:t xml:space="preserve">Ecce equidem licite prædicit talia numen.</w:t>
+          <w:rStyle w:val="FunctionTok"/>
+        </w:rPr>
+        <w:t xml:space="preserve">Oracle</w:t>
+      </w:r>
+      <w:r>
+        <w:rPr>
+          <w:rStyle w:val="NormalTok"/>
+        </w:rPr>
+        <w:t xml:space="preserve">(</w:t>
+      </w:r>
+      <w:r>
+        <w:rPr>
+          <w:rStyle w:val="StringTok"/>
+        </w:rPr>
+        <w:t xml:space="preserve">"Celui que j'aime deviendra-t-il cette année mon époux ?"</w:t>
+      </w:r>
+      <w:r>
+        <w:rPr>
+          <w:rStyle w:val="NormalTok"/>
+        </w:rPr>
+        <w:t xml:space="preserve">)</w:t>
       </w:r>
     </w:p>
     <w:p>
       <w:pPr>
+        <w:pStyle w:val="SourceCode"/>
+      </w:pPr>
+      <w:r>
+        <w:rPr>
+          <w:rStyle w:val="VerbatimChar"/>
+        </w:rPr>
+        <w:t xml:space="preserve">Ecce equidem licite prædicit talia numen.</w:t>
+      </w:r>
+    </w:p>
+    <w:p>
+      <w:pPr>
         <w:pStyle w:val="FirstParagraph"/>
       </w:pPr>
       <w:r>
@@ -743,8 +819,8 @@
         <w:t xml:space="preserve">Tanta lubens cupido nonindet prospera sydus.</w:t>
       </w:r>
     </w:p>
-    <w:bookmarkEnd w:id="19"/>
-    <w:bookmarkStart w:id="20" w:name="a-helpful-oracle"/>
+    <w:bookmarkEnd w:id="20"/>
+    <w:bookmarkStart w:id="21" w:name="a-helpful-oracle"/>
     <w:p>
       <w:pPr>
         <w:pStyle w:val="Heading2"/>
@@ -927,8 +1003,8 @@
         <w:t xml:space="preserve">(I count as he does: a euphonic "-t-" stays with the word before it, so "deviendra-t-il" is two words, "deviendra-t" and "il".)</w:t>
       </w:r>
     </w:p>
-    <w:bookmarkEnd w:id="20"/>
-    <w:bookmarkStart w:id="21" w:name="how-the-program-follows-the-pamphlet"/>
+    <w:bookmarkEnd w:id="21"/>
+    <w:bookmarkStart w:id="22" w:name="how-the-program-follows-the-pamphlet"/>
     <w:p>
       <w:pPr>
         <w:pStyle w:val="Heading2"/>
@@ -1840,8 +1916,8 @@
         <w:t xml:space="preserve">}</w:t>
       </w:r>
     </w:p>
-    <w:bookmarkEnd w:id="21"/>
-    <w:bookmarkStart w:id="22" w:name="what-the-oracle-can-say"/>
+    <w:bookmarkEnd w:id="22"/>
+    <w:bookmarkStart w:id="23" w:name="what-the-oracle-can-say"/>
     <w:p>
       <w:pPr>
         <w:pStyle w:val="Heading2"/>
@@ -4452,8 +4528,8 @@
         <w:t xml:space="preserve">Ecce equidem licite prædicit talia numen.</w:t>
       </w:r>
     </w:p>
-    <w:bookmarkEnd w:id="22"/>
-    <w:bookmarkStart w:id="23" w:name="checks"/>
+    <w:bookmarkEnd w:id="23"/>
+    <w:bookmarkStart w:id="24" w:name="checks"/>
     <w:p>
       <w:pPr>
         <w:pStyle w:val="Heading2"/>
@@ -4485,10 +4561,13 @@
         <w:rPr>
           <w:rStyle w:val="VerbatimChar"/>
         </w:rPr>
-        <w:t xml:space="preserve">Rscript oracle-tests.R</w:t>
-      </w:r>
-      <w:r>
-        <w:t xml:space="preserve">) makes 40 checks. The expected values come from the pamphlet, not from the program: the four questions of pp. 20–21 (nine words each), the sums, key and triangle of the worked examples (pp. 25 and 53), the grid, numbers, parts and cells of the first example (pp. 36, 44 and 49–52), and the two verses printed on pp. 52 and 55. Further checks concern the transcribed tables: the 162 numbers of the first table all follow the pattern the arithmetic dictates, and every cell of the second is a letter, a syllable or a “+”.</w:t>
+        <w:t xml:space="preserve">Rscript R/oracle-tests.R</w:t>
+      </w:r>
+      <w:r>
+        <w:t xml:space="preserve"> </w:t>
+      </w:r>
+      <w:r>
+        <w:t xml:space="preserve">from the repo root) makes 40 checks. The expected values come from the pamphlet, not from the program: the four questions of pp. 20–21 (nine words each), the sums, key and triangle of the worked examples (pp. 25 and 53), the grid, numbers, parts and cells of the first example (pp. 36, 44 and 49–52), and the two verses printed on pp. 52 and 55. Further checks concern the transcribed tables: the 162 numbers of the first table all follow the pattern the arithmetic dictates, and every cell of the second is a letter, a syllable or a “+”.</w:t>
       </w:r>
     </w:p>
     <w:p>
@@ -4499,8 +4578,8 @@
         <w:t xml:space="preserve">The two printed examples confirm directly 60 of the 324 cells of the second table. The others rest on a careful reading of the plate, and on the fact that all but two of the 54 words they spell read as Latin (Table A2). A misreading of a cell would be likely to show up as a non-word in that table.</w:t>
       </w:r>
     </w:p>
-    <w:bookmarkEnd w:id="23"/>
-    <w:bookmarkStart w:id="24" w:name="conventions-of-the-transcription"/>
+    <w:bookmarkEnd w:id="24"/>
+    <w:bookmarkStart w:id="25" w:name="conventions-of-the-transcription"/>
     <w:p>
       <w:pPr>
         <w:pStyle w:val="Heading2"/>
@@ -4671,8 +4750,8 @@
         <w:t xml:space="preserve">; the program returns the latter.</w:t>
       </w:r>
     </w:p>
-    <w:bookmarkEnd w:id="24"/>
-    <w:bookmarkStart w:id="28" w:name="bibliography"/>
+    <w:bookmarkEnd w:id="25"/>
+    <w:bookmarkStart w:id="29" w:name="bibliography"/>
     <w:p>
       <w:pPr>
         <w:pStyle w:val="Heading2"/>
@@ -4681,8 +4760,8 @@
         <w:t xml:space="preserve">Bibliography</w:t>
       </w:r>
     </w:p>
-    <w:bookmarkStart w:id="27" w:name="refs"/>
-    <w:bookmarkStart w:id="26" w:name="ref-Migneret1759"/>
+    <w:bookmarkStart w:id="28" w:name="refs"/>
+    <w:bookmarkStart w:id="27" w:name="ref-Migneret1759"/>
     <w:p>
       <w:pPr>
         <w:pStyle w:val="Bibliography"/>
@@ -4706,7 +4785,7 @@
       <w:r>
         <w:t xml:space="preserve"> </w:t>
       </w:r>
-      <w:hyperlink r:id="rId25">
+      <w:hyperlink r:id="rId26">
         <w:r>
           <w:rPr>
             <w:rStyle w:val="Hyperlink"/>
@@ -4714,13 +4793,10 @@
           <w:t xml:space="preserve">https://friendly.github.io/papers/Migneret1759.pdf</w:t>
         </w:r>
       </w:hyperlink>
-      <w:r>
-        <w:t xml:space="preserve">, consulted on 19/09/2026.</w:t>
-      </w:r>
     </w:p>
-    <w:bookmarkEnd w:id="26"/>
     <w:bookmarkEnd w:id="27"/>
     <w:bookmarkEnd w:id="28"/>
+    <w:bookmarkEnd w:id="29"/>
     <w:sectPr>
       <w:footerReference r:id="rId9" w:type="default"/>
       <w:footnotePr>

</xml_diff>